<commit_message>
Test Execution & Test Closure
</commit_message>
<xml_diff>
--- a/week-03/Day-02/Week3_Homework.docx
+++ b/week-03/Day-02/Week3_Homework.docx
@@ -121,7 +121,15 @@
                 <w:sz w:val="22"/>
                 <w:szCs w:val="22"/>
               </w:rPr>
-              <w:t>Today you learned what separates a bug report a developer can actually act on from one that just bounces back with "can you explain more?" Time to write a couple of your own, for real bugs, found by you.</w:t>
+              <w:t>Y</w:t>
+            </w:r>
+            <w:r>
+              <w:rPr>
+                <w:color w:val="FFFFFF"/>
+                <w:sz w:val="22"/>
+                <w:szCs w:val="22"/>
+              </w:rPr>
+              <w:t>ou learned what separates a bug report a developer can actually act on from one that just bounces back with "can you explain more?" Time to write a couple of your own, for real bugs, found by you.</w:t>
             </w:r>
           </w:p>
         </w:tc>
@@ -162,7 +170,39 @@
           <w:sz w:val="22"/>
           <w:szCs w:val="22"/>
         </w:rPr>
-        <w:t>Go to saucedemo.com and log in with username "problem_user", password "secret_sauce".</w:t>
+        <w:t>Go to saucedemo.com and log in with username "</w:t>
+      </w:r>
+      <w:proofErr w:type="spellStart"/>
+      <w:r>
+        <w:rPr>
+          <w:sz w:val="22"/>
+          <w:szCs w:val="22"/>
+        </w:rPr>
+        <w:t>problem_user</w:t>
+      </w:r>
+      <w:proofErr w:type="spellEnd"/>
+      <w:r>
+        <w:rPr>
+          <w:sz w:val="22"/>
+          <w:szCs w:val="22"/>
+        </w:rPr>
+        <w:t>", password "</w:t>
+      </w:r>
+      <w:proofErr w:type="spellStart"/>
+      <w:r>
+        <w:rPr>
+          <w:sz w:val="22"/>
+          <w:szCs w:val="22"/>
+        </w:rPr>
+        <w:t>secret_sauce</w:t>
+      </w:r>
+      <w:proofErr w:type="spellEnd"/>
+      <w:r>
+        <w:rPr>
+          <w:sz w:val="22"/>
+          <w:szCs w:val="22"/>
+        </w:rPr>
+        <w:t>".</w:t>
       </w:r>
     </w:p>
     <w:p>
@@ -202,7 +242,47 @@
           <w:sz w:val="22"/>
           <w:szCs w:val="22"/>
         </w:rPr>
-        <w:t>Write a full bug report using today's template — Bug ID, Title, Environment, Steps to Reproduce, Expected Result, Actual Result, Severity, Priority, Status.</w:t>
+        <w:t xml:space="preserve">Write a full bug report using </w:t>
+      </w:r>
+      <w:r>
+        <w:rPr>
+          <w:sz w:val="22"/>
+          <w:szCs w:val="22"/>
+        </w:rPr>
+        <w:t>the</w:t>
+      </w:r>
+      <w:r>
+        <w:rPr>
+          <w:sz w:val="22"/>
+          <w:szCs w:val="22"/>
+        </w:rPr>
+        <w:t xml:space="preserve"> template</w:t>
+      </w:r>
+      <w:r>
+        <w:rPr>
+          <w:sz w:val="22"/>
+          <w:szCs w:val="22"/>
+        </w:rPr>
+        <w:t xml:space="preserve"> on</w:t>
+      </w:r>
+      <w:r>
+        <w:rPr>
+          <w:sz w:val="22"/>
+          <w:szCs w:val="22"/>
+        </w:rPr>
+        <w:t xml:space="preserve"> the reference section.</w:t>
+      </w:r>
+    </w:p>
+    <w:p>
+      <w:pPr>
+        <w:spacing w:after="140"/>
+      </w:pPr>
+      <w:r>
+        <w:rPr>
+          <w:sz w:val="22"/>
+          <w:szCs w:val="22"/>
+        </w:rPr>
+        <w:t xml:space="preserve"> — Bug ID, Title, Environment, Steps to Reproduce, Expected Result, Actual Result, Severity, Priority, Status.</w:t>
       </w:r>
     </w:p>
     <w:p>
@@ -285,7 +365,27 @@
                 <w:sz w:val="21"/>
                 <w:szCs w:val="21"/>
               </w:rPr>
-              <w:t>Scenario — QuickCart Shopping App</w:t>
+              <w:t xml:space="preserve">Scenario — </w:t>
+            </w:r>
+            <w:proofErr w:type="spellStart"/>
+            <w:r>
+              <w:rPr>
+                <w:b/>
+                <w:bCs/>
+                <w:sz w:val="21"/>
+                <w:szCs w:val="21"/>
+              </w:rPr>
+              <w:t>QuickCart</w:t>
+            </w:r>
+            <w:proofErr w:type="spellEnd"/>
+            <w:r>
+              <w:rPr>
+                <w:b/>
+                <w:bCs/>
+                <w:sz w:val="21"/>
+                <w:szCs w:val="21"/>
+              </w:rPr>
+              <w:t xml:space="preserve"> Shopping App</w:t>
             </w:r>
           </w:p>
           <w:p>
@@ -320,7 +420,35 @@
           <w:sz w:val="22"/>
           <w:szCs w:val="22"/>
         </w:rPr>
-        <w:t>Write a full bug report for this scenario using today's template.</w:t>
+        <w:t>Write a full bug report for this scenario using template</w:t>
+      </w:r>
+      <w:r>
+        <w:rPr>
+          <w:sz w:val="22"/>
+          <w:szCs w:val="22"/>
+        </w:rPr>
+        <w:t xml:space="preserve"> </w:t>
+      </w:r>
+      <w:r>
+        <w:rPr>
+          <w:sz w:val="22"/>
+          <w:szCs w:val="22"/>
+        </w:rPr>
+        <w:t xml:space="preserve">on </w:t>
+      </w:r>
+      <w:r>
+        <w:rPr>
+          <w:sz w:val="22"/>
+          <w:szCs w:val="22"/>
+        </w:rPr>
+        <w:t xml:space="preserve"> the reference section</w:t>
+      </w:r>
+      <w:r>
+        <w:rPr>
+          <w:sz w:val="22"/>
+          <w:szCs w:val="22"/>
+        </w:rPr>
+        <w:t>.</w:t>
       </w:r>
     </w:p>
     <w:p>
@@ -366,7 +494,15 @@
         <w:spacing w:after="150"/>
       </w:pPr>
       <w:r>
-        <w:t>Submit both bug reports together: Part A (Sauce Demo) and Part B (QuickCart scenario).</w:t>
+        <w:t>Submit both bug reports together: Part A (Sauce Demo) and Part B (</w:t>
+      </w:r>
+      <w:proofErr w:type="spellStart"/>
+      <w:r>
+        <w:t>QuickCart</w:t>
+      </w:r>
+      <w:proofErr w:type="spellEnd"/>
+      <w:r>
+        <w:t xml:space="preserve"> scenario).</w:t>
       </w:r>
     </w:p>
     <w:p>
@@ -432,7 +568,15 @@
         <w:spacing w:after="150"/>
       </w:pPr>
       <w:r>
-        <w:t>"What makes a good bug report?" and "what's the difference between Severity and Priority?" are both classic junior QA interview questions. After tonight, you'll have real, personal examples ready — not just definitions you memorised.</w:t>
+        <w:t xml:space="preserve">"What makes a good bug report?" and "what's the difference between Severity and Priority?" are both classic junior QA interview questions. After tonight, you'll have real, personal examples ready — not just definitions you </w:t>
+      </w:r>
+      <w:proofErr w:type="spellStart"/>
+      <w:r>
+        <w:t>memorised</w:t>
+      </w:r>
+      <w:proofErr w:type="spellEnd"/>
+      <w:r>
+        <w:t>.</w:t>
       </w:r>
     </w:p>
     <w:p>
@@ -1097,16 +1241,7 @@
           <w:szCs w:val="40"/>
         </w:rPr>
         <w:lastRenderedPageBreak/>
-        <w:t>Homework</w:t>
-      </w:r>
-      <w:r>
-        <w:rPr>
-          <w:b/>
-          <w:bCs/>
-          <w:sz w:val="40"/>
-          <w:szCs w:val="40"/>
-        </w:rPr>
-        <w:t xml:space="preserve"> 2</w:t>
+        <w:t>Homework 2</w:t>
       </w:r>
     </w:p>
     <w:p>
@@ -1146,12 +1281,6 @@
         <w:gridCol w:w="9016"/>
       </w:tblGrid>
       <w:tr>
-        <w:tblPrEx>
-          <w:tblCellMar>
-            <w:top w:w="0" w:type="dxa"/>
-            <w:bottom w:w="0" w:type="dxa"/>
-          </w:tblCellMar>
-        </w:tblPrEx>
         <w:tc>
           <w:tcPr>
             <w:tcW w:w="5000" w:type="pct"/>
@@ -1252,12 +1381,6 @@
         <w:gridCol w:w="9016"/>
       </w:tblGrid>
       <w:tr>
-        <w:tblPrEx>
-          <w:tblCellMar>
-            <w:top w:w="0" w:type="dxa"/>
-            <w:bottom w:w="0" w:type="dxa"/>
-          </w:tblCellMar>
-        </w:tblPrEx>
         <w:tc>
           <w:tcPr>
             <w:tcW w:w="5000" w:type="pct"/>
@@ -1286,7 +1409,27 @@
                 <w:sz w:val="21"/>
                 <w:szCs w:val="21"/>
               </w:rPr>
-              <w:t>Story — BUG_042 on the eHome Affairs Booking Site</w:t>
+              <w:t xml:space="preserve">Story — BUG_042 on the </w:t>
+            </w:r>
+            <w:proofErr w:type="spellStart"/>
+            <w:r>
+              <w:rPr>
+                <w:b/>
+                <w:bCs/>
+                <w:sz w:val="21"/>
+                <w:szCs w:val="21"/>
+              </w:rPr>
+              <w:t>eHome</w:t>
+            </w:r>
+            <w:proofErr w:type="spellEnd"/>
+            <w:r>
+              <w:rPr>
+                <w:b/>
+                <w:bCs/>
+                <w:sz w:val="21"/>
+                <w:szCs w:val="21"/>
+              </w:rPr>
+              <w:t xml:space="preserve"> Affairs Booking Site</w:t>
             </w:r>
           </w:p>
           <w:p>
@@ -1412,12 +1555,6 @@
         <w:gridCol w:w="4471"/>
       </w:tblGrid>
       <w:tr>
-        <w:tblPrEx>
-          <w:tblCellMar>
-            <w:top w:w="0" w:type="dxa"/>
-            <w:bottom w:w="0" w:type="dxa"/>
-          </w:tblCellMar>
-        </w:tblPrEx>
         <w:tc>
           <w:tcPr>
             <w:tcW w:w="6000" w:type="dxa"/>
@@ -1474,12 +1611,6 @@
         </w:tc>
       </w:tr>
       <w:tr>
-        <w:tblPrEx>
-          <w:tblCellMar>
-            <w:top w:w="0" w:type="dxa"/>
-            <w:bottom w:w="0" w:type="dxa"/>
-          </w:tblCellMar>
-        </w:tblPrEx>
         <w:tc>
           <w:tcPr>
             <w:tcW w:w="6000" w:type="dxa"/>
@@ -1522,12 +1653,6 @@
         </w:tc>
       </w:tr>
       <w:tr>
-        <w:tblPrEx>
-          <w:tblCellMar>
-            <w:top w:w="0" w:type="dxa"/>
-            <w:bottom w:w="0" w:type="dxa"/>
-          </w:tblCellMar>
-        </w:tblPrEx>
         <w:tc>
           <w:tcPr>
             <w:tcW w:w="6000" w:type="dxa"/>
@@ -1570,12 +1695,6 @@
         </w:tc>
       </w:tr>
       <w:tr>
-        <w:tblPrEx>
-          <w:tblCellMar>
-            <w:top w:w="0" w:type="dxa"/>
-            <w:bottom w:w="0" w:type="dxa"/>
-          </w:tblCellMar>
-        </w:tblPrEx>
         <w:tc>
           <w:tcPr>
             <w:tcW w:w="6000" w:type="dxa"/>
@@ -1618,12 +1737,6 @@
         </w:tc>
       </w:tr>
       <w:tr>
-        <w:tblPrEx>
-          <w:tblCellMar>
-            <w:top w:w="0" w:type="dxa"/>
-            <w:bottom w:w="0" w:type="dxa"/>
-          </w:tblCellMar>
-        </w:tblPrEx>
         <w:tc>
           <w:tcPr>
             <w:tcW w:w="6000" w:type="dxa"/>
@@ -1666,12 +1779,6 @@
         </w:tc>
       </w:tr>
       <w:tr>
-        <w:tblPrEx>
-          <w:tblCellMar>
-            <w:top w:w="0" w:type="dxa"/>
-            <w:bottom w:w="0" w:type="dxa"/>
-          </w:tblCellMar>
-        </w:tblPrEx>
         <w:tc>
           <w:tcPr>
             <w:tcW w:w="6000" w:type="dxa"/>
@@ -1714,12 +1821,6 @@
         </w:tc>
       </w:tr>
       <w:tr>
-        <w:tblPrEx>
-          <w:tblCellMar>
-            <w:top w:w="0" w:type="dxa"/>
-            <w:bottom w:w="0" w:type="dxa"/>
-          </w:tblCellMar>
-        </w:tblPrEx>
         <w:tc>
           <w:tcPr>
             <w:tcW w:w="6000" w:type="dxa"/>
@@ -1824,7 +1925,25 @@
           <w:iCs/>
           <w:color w:val="028090"/>
         </w:rPr>
-        <w:t>Writing the story yourself is even better practice than tracing someone else's — it forces you to think about the whole cycle, not just recognise it.</w:t>
+        <w:t xml:space="preserve">Writing the story yourself is even better practice than tracing someone else's — it forces you to think about the whole cycle, not just </w:t>
+      </w:r>
+      <w:proofErr w:type="spellStart"/>
+      <w:r>
+        <w:rPr>
+          <w:i/>
+          <w:iCs/>
+          <w:color w:val="028090"/>
+        </w:rPr>
+        <w:t>recognise</w:t>
+      </w:r>
+      <w:proofErr w:type="spellEnd"/>
+      <w:r>
+        <w:rPr>
+          <w:i/>
+          <w:iCs/>
+          <w:color w:val="028090"/>
+        </w:rPr>
+        <w:t xml:space="preserve"> it.</w:t>
       </w:r>
     </w:p>
     <w:p>
@@ -1850,7 +1969,15 @@
         <w:spacing w:after="150"/>
       </w:pPr>
       <w:r>
-        <w:t>"Can you walk me through the defect life cycle?" is one of the most commonly asked questions in junior QA interviews. After tonight, you'll have a real, personal example ready — one you traced yourself, not just a list of words memorised.</w:t>
+        <w:t xml:space="preserve">"Can you walk me through the defect life cycle?" is one of the most commonly asked questions in junior QA interviews. After tonight, you'll have a real, personal example ready — one you traced yourself, not just a list of words </w:t>
+      </w:r>
+      <w:proofErr w:type="spellStart"/>
+      <w:r>
+        <w:t>memorised</w:t>
+      </w:r>
+      <w:proofErr w:type="spellEnd"/>
+      <w:r>
+        <w:t>.</w:t>
       </w:r>
     </w:p>
     <w:p>
@@ -1983,12 +2110,6 @@
         <w:gridCol w:w="4530"/>
       </w:tblGrid>
       <w:tr>
-        <w:tblPrEx>
-          <w:tblCellMar>
-            <w:top w:w="0" w:type="dxa"/>
-            <w:bottom w:w="0" w:type="dxa"/>
-          </w:tblCellMar>
-        </w:tblPrEx>
         <w:tc>
           <w:tcPr>
             <w:tcW w:w="6000" w:type="dxa"/>
@@ -2045,12 +2166,6 @@
         </w:tc>
       </w:tr>
       <w:tr>
-        <w:tblPrEx>
-          <w:tblCellMar>
-            <w:top w:w="0" w:type="dxa"/>
-            <w:bottom w:w="0" w:type="dxa"/>
-          </w:tblCellMar>
-        </w:tblPrEx>
         <w:tc>
           <w:tcPr>
             <w:tcW w:w="6000" w:type="dxa"/>
@@ -2097,12 +2212,6 @@
         </w:tc>
       </w:tr>
       <w:tr>
-        <w:tblPrEx>
-          <w:tblCellMar>
-            <w:top w:w="0" w:type="dxa"/>
-            <w:bottom w:w="0" w:type="dxa"/>
-          </w:tblCellMar>
-        </w:tblPrEx>
         <w:tc>
           <w:tcPr>
             <w:tcW w:w="6000" w:type="dxa"/>
@@ -2149,12 +2258,6 @@
         </w:tc>
       </w:tr>
       <w:tr>
-        <w:tblPrEx>
-          <w:tblCellMar>
-            <w:top w:w="0" w:type="dxa"/>
-            <w:bottom w:w="0" w:type="dxa"/>
-          </w:tblCellMar>
-        </w:tblPrEx>
         <w:tc>
           <w:tcPr>
             <w:tcW w:w="6000" w:type="dxa"/>
@@ -2201,12 +2304,6 @@
         </w:tc>
       </w:tr>
       <w:tr>
-        <w:tblPrEx>
-          <w:tblCellMar>
-            <w:top w:w="0" w:type="dxa"/>
-            <w:bottom w:w="0" w:type="dxa"/>
-          </w:tblCellMar>
-        </w:tblPrEx>
         <w:tc>
           <w:tcPr>
             <w:tcW w:w="6000" w:type="dxa"/>
@@ -2253,12 +2350,6 @@
         </w:tc>
       </w:tr>
       <w:tr>
-        <w:tblPrEx>
-          <w:tblCellMar>
-            <w:top w:w="0" w:type="dxa"/>
-            <w:bottom w:w="0" w:type="dxa"/>
-          </w:tblCellMar>
-        </w:tblPrEx>
         <w:tc>
           <w:tcPr>
             <w:tcW w:w="6000" w:type="dxa"/>
@@ -2305,12 +2396,6 @@
         </w:tc>
       </w:tr>
       <w:tr>
-        <w:tblPrEx>
-          <w:tblCellMar>
-            <w:top w:w="0" w:type="dxa"/>
-            <w:bottom w:w="0" w:type="dxa"/>
-          </w:tblCellMar>
-        </w:tblPrEx>
         <w:tc>
           <w:tcPr>
             <w:tcW w:w="6000" w:type="dxa"/>
@@ -2357,12 +2442,6 @@
         </w:tc>
       </w:tr>
       <w:tr>
-        <w:tblPrEx>
-          <w:tblCellMar>
-            <w:top w:w="0" w:type="dxa"/>
-            <w:bottom w:w="0" w:type="dxa"/>
-          </w:tblCellMar>
-        </w:tblPrEx>
         <w:tc>
           <w:tcPr>
             <w:tcW w:w="6000" w:type="dxa"/>
@@ -2409,12 +2488,6 @@
         </w:tc>
       </w:tr>
       <w:tr>
-        <w:tblPrEx>
-          <w:tblCellMar>
-            <w:top w:w="0" w:type="dxa"/>
-            <w:bottom w:w="0" w:type="dxa"/>
-          </w:tblCellMar>
-        </w:tblPrEx>
         <w:tc>
           <w:tcPr>
             <w:tcW w:w="6000" w:type="dxa"/>
@@ -2462,12 +2535,6 @@
         </w:tc>
       </w:tr>
       <w:tr>
-        <w:tblPrEx>
-          <w:tblCellMar>
-            <w:top w:w="0" w:type="dxa"/>
-            <w:bottom w:w="0" w:type="dxa"/>
-          </w:tblCellMar>
-        </w:tblPrEx>
         <w:tc>
           <w:tcPr>
             <w:tcW w:w="6000" w:type="dxa"/>
@@ -3144,6 +3211,7 @@
   <w:style w:type="paragraph" w:default="1" w:styleId="Normal">
     <w:name w:val="Normal"/>
     <w:qFormat/>
+    <w:rsid w:val="0071131F"/>
   </w:style>
   <w:style w:type="paragraph" w:styleId="Heading1">
     <w:name w:val="heading 1"/>
@@ -3233,6 +3301,7 @@
   <w:style w:type="character" w:default="1" w:styleId="DefaultParagraphFont">
     <w:name w:val="Default Paragraph Font"/>
     <w:uiPriority w:val="1"/>
+    <w:semiHidden/>
     <w:unhideWhenUsed/>
   </w:style>
   <w:style w:type="table" w:default="1" w:styleId="TableNormal">
@@ -3668,4 +3737,16 @@
     </a:ext>
   </a:extLst>
 </a:theme>
+</file>
+
+<file path=customXml/item1.xml><?xml version="1.0" encoding="utf-8"?>
+<b:Sources xmlns:b="http://schemas.openxmlformats.org/officeDocument/2006/bibliography" xmlns="http://schemas.openxmlformats.org/officeDocument/2006/bibliography" SelectedStyle="\APASixthEditionOfficeOnline.xsl" StyleName="APA" Version="6"/>
+</file>
+
+<file path=customXml/itemProps1.xml><?xml version="1.0" encoding="utf-8"?>
+<ds:datastoreItem xmlns:ds="http://schemas.openxmlformats.org/officeDocument/2006/customXml" ds:itemID="{0104CDF4-0E08-42E0-AC85-BAD4F6D76F9A}">
+  <ds:schemaRefs>
+    <ds:schemaRef ds:uri="http://schemas.openxmlformats.org/officeDocument/2006/bibliography"/>
+  </ds:schemaRefs>
+</ds:datastoreItem>
 </file>
</xml_diff>